<commit_message>
refactor(docx-submission): improve field positioning accuracy
Refactors the DOCX field positioning logic to use structural context from the original DOCX document. This new approach leverages the `docx` gem to understand labels and table columns, then uses Pdfium to find positions relative to these labels in the tagged PDF. This significantly improves accuracy, especially for fields within tables, preventing issues like incorrect assignments.

Introduces `Templates::ExtractDocxFieldPositions` for this new logic. Additionally, DOCX tags are now replaced with invisible underscore placeholders to maintain layout consistency during PDF conversion.
</commit_message>
<xml_diff>
--- a/docs/samples/simple.docx
+++ b/docs/samples/simple.docx
@@ -440,7 +440,7 @@
         <w:rPr>
           <w:lang w:val="pt-PT"/>
         </w:rPr>
-        <w:t>[[end]]</w:t>
+        <w:t>x</w:t>
       </w:r>
     </w:p>
     <w:p>
@@ -626,13 +626,21 @@
     <w:p>
       <w:pPr>
         <w:pStyle w:val="BodyA"/>
-      </w:pPr>
-      <w:r>
         <w:rPr>
           <w:lang w:val="pt-PT"/>
         </w:rPr>
+      </w:pPr>
+      <w:r>
+        <w:rPr>
+          <w:lang w:val="pt-PT"/>
+        </w:rPr>
         <w:t>SIGNATURES</w:t>
       </w:r>
+    </w:p>
+    <w:p>
+      <w:pPr>
+        <w:pStyle w:val="BodyA"/>
+      </w:pPr>
     </w:p>
     <w:p>
       <w:pPr>
@@ -662,23 +670,47 @@
         <w:tblLook w:val="04A0" w:firstRow="1" w:lastRow="0" w:firstColumn="1" w:lastColumn="0" w:noHBand="0" w:noVBand="1"/>
       </w:tblPr>
       <w:tblGrid>
-        <w:gridCol w:w="4696"/>
-        <w:gridCol w:w="4654"/>
+        <w:gridCol w:w="3099"/>
+        <w:gridCol w:w="3073"/>
+        <w:gridCol w:w="3178"/>
       </w:tblGrid>
       <w:tr>
         <w:tc>
           <w:tcPr>
-            <w:tcW w:w="4675" w:type="dxa"/>
+            <w:tcW w:w="4585" w:type="dxa"/>
           </w:tcPr>
           <w:p>
             <w:pPr>
               <w:pStyle w:val="BodyA"/>
-            </w:pPr>
-            <w:r>
-              <w:rPr>
-                <w:lang w:val="en-US"/>
-              </w:rPr>
-              <w:t>Buyer Signature: {{</w:t>
+              <w:rPr>
+                <w:lang w:val="en-US"/>
+              </w:rPr>
+            </w:pPr>
+            <w:r>
+              <w:rPr>
+                <w:lang w:val="en-US"/>
+              </w:rPr>
+              <w:t xml:space="preserve">Buyer Signature: </w:t>
+            </w:r>
+          </w:p>
+          <w:p>
+            <w:pPr>
+              <w:pStyle w:val="BodyA"/>
+              <w:rPr>
+                <w:lang w:val="en-US"/>
+              </w:rPr>
+            </w:pPr>
+            <w:r>
+              <w:rPr>
+                <w:lang w:val="en-US"/>
+              </w:rPr>
+              <w:br/>
+            </w:r>
+            <w:r>
+              <w:rPr>
+                <w:lang w:val="en-US"/>
+              </w:rPr>
+              <w:t>{{</w:t>
             </w:r>
             <w:proofErr w:type="gramStart"/>
             <w:r>
@@ -722,21 +754,51 @@
               </w:rPr>
               <w:t>=true}}</w:t>
             </w:r>
+          </w:p>
+          <w:p>
+            <w:pPr>
+              <w:pStyle w:val="BodyA"/>
+            </w:pPr>
           </w:p>
         </w:tc>
         <w:tc>
           <w:tcPr>
-            <w:tcW w:w="4675" w:type="dxa"/>
+            <w:tcW w:w="4544" w:type="dxa"/>
           </w:tcPr>
           <w:p>
             <w:pPr>
               <w:pStyle w:val="BodyA"/>
-            </w:pPr>
-            <w:r>
-              <w:rPr>
-                <w:lang w:val="en-US"/>
-              </w:rPr>
-              <w:t>Seller Signature: {{</w:t>
+              <w:rPr>
+                <w:lang w:val="en-US"/>
+              </w:rPr>
+            </w:pPr>
+            <w:r>
+              <w:rPr>
+                <w:lang w:val="en-US"/>
+              </w:rPr>
+              <w:t xml:space="preserve">Seller Signature: </w:t>
+            </w:r>
+          </w:p>
+          <w:p>
+            <w:pPr>
+              <w:pStyle w:val="BodyA"/>
+              <w:rPr>
+                <w:lang w:val="en-US"/>
+              </w:rPr>
+            </w:pPr>
+          </w:p>
+          <w:p>
+            <w:pPr>
+              <w:pStyle w:val="BodyA"/>
+              <w:rPr>
+                <w:lang w:val="en-US"/>
+              </w:rPr>
+            </w:pPr>
+            <w:r>
+              <w:rPr>
+                <w:lang w:val="en-US"/>
+              </w:rPr>
+              <w:t>{{</w:t>
             </w:r>
             <w:proofErr w:type="gramStart"/>
             <w:r>
@@ -779,6 +841,260 @@
                 <w:lang w:val="en-US"/>
               </w:rPr>
               <w:t>=true}}</w:t>
+            </w:r>
+          </w:p>
+          <w:p>
+            <w:pPr>
+              <w:pStyle w:val="BodyA"/>
+            </w:pPr>
+          </w:p>
+        </w:tc>
+        <w:tc>
+          <w:tcPr>
+            <w:tcW w:w="221" w:type="dxa"/>
+          </w:tcPr>
+          <w:p>
+            <w:pPr>
+              <w:pStyle w:val="BodyA"/>
+              <w:rPr>
+                <w:lang w:val="en-US"/>
+              </w:rPr>
+            </w:pPr>
+            <w:r>
+              <w:rPr>
+                <w:lang w:val="en-US"/>
+              </w:rPr>
+              <w:t>Owner</w:t>
+            </w:r>
+            <w:r>
+              <w:rPr>
+                <w:lang w:val="en-US"/>
+              </w:rPr>
+              <w:t xml:space="preserve"> Signature: </w:t>
+            </w:r>
+          </w:p>
+          <w:p>
+            <w:pPr>
+              <w:pStyle w:val="BodyA"/>
+              <w:rPr>
+                <w:lang w:val="en-US"/>
+              </w:rPr>
+            </w:pPr>
+          </w:p>
+          <w:p>
+            <w:pPr>
+              <w:pStyle w:val="BodyA"/>
+              <w:rPr>
+                <w:lang w:val="en-US"/>
+              </w:rPr>
+            </w:pPr>
+            <w:r>
+              <w:rPr>
+                <w:lang w:val="en-US"/>
+              </w:rPr>
+              <w:t>{{</w:t>
+            </w:r>
+            <w:proofErr w:type="gramStart"/>
+            <w:r>
+              <w:rPr>
+                <w:lang w:val="en-US"/>
+              </w:rPr>
+              <w:t>Owner</w:t>
+            </w:r>
+            <w:r>
+              <w:rPr>
+                <w:lang w:val="en-US"/>
+              </w:rPr>
+              <w:t>Sign;type</w:t>
+            </w:r>
+            <w:proofErr w:type="gramEnd"/>
+            <w:r>
+              <w:rPr>
+                <w:lang w:val="en-US"/>
+              </w:rPr>
+              <w:t>=</w:t>
+            </w:r>
+            <w:proofErr w:type="gramStart"/>
+            <w:r>
+              <w:rPr>
+                <w:lang w:val="en-US"/>
+              </w:rPr>
+              <w:t>signature;role</w:t>
+            </w:r>
+            <w:proofErr w:type="gramEnd"/>
+            <w:r>
+              <w:rPr>
+                <w:lang w:val="en-US"/>
+              </w:rPr>
+              <w:t>=</w:t>
+            </w:r>
+            <w:proofErr w:type="gramStart"/>
+            <w:r>
+              <w:rPr>
+                <w:lang w:val="en-US"/>
+              </w:rPr>
+              <w:t>Owner</w:t>
+            </w:r>
+            <w:r>
+              <w:rPr>
+                <w:lang w:val="en-US"/>
+              </w:rPr>
+              <w:t>;required</w:t>
+            </w:r>
+            <w:proofErr w:type="gramEnd"/>
+            <w:r>
+              <w:rPr>
+                <w:lang w:val="en-US"/>
+              </w:rPr>
+              <w:t>=true}}</w:t>
+            </w:r>
+          </w:p>
+          <w:p>
+            <w:pPr>
+              <w:pStyle w:val="BodyA"/>
+              <w:rPr>
+                <w:lang w:val="en-US"/>
+              </w:rPr>
+            </w:pPr>
+          </w:p>
+        </w:tc>
+      </w:tr>
+      <w:tr>
+        <w:tc>
+          <w:tcPr>
+            <w:tcW w:w="4585" w:type="dxa"/>
+          </w:tcPr>
+          <w:p>
+            <w:pPr>
+              <w:pStyle w:val="BodyA"/>
+              <w:rPr>
+                <w:lang w:val="en-US"/>
+              </w:rPr>
+            </w:pPr>
+            <w:r>
+              <w:rPr>
+                <w:lang w:val="en-US"/>
+              </w:rPr>
+              <w:t xml:space="preserve">Buyer Name: </w:t>
+            </w:r>
+          </w:p>
+          <w:p>
+            <w:pPr>
+              <w:pStyle w:val="BodyA"/>
+              <w:rPr>
+                <w:lang w:val="en-US"/>
+              </w:rPr>
+            </w:pPr>
+            <w:r>
+              <w:rPr>
+                <w:lang w:val="en-US"/>
+              </w:rPr>
+              <w:br/>
+            </w:r>
+            <w:r>
+              <w:rPr>
+                <w:lang w:val="en-US"/>
+              </w:rPr>
+              <w:t>{{</w:t>
+            </w:r>
+            <w:proofErr w:type="gramStart"/>
+            <w:r>
+              <w:rPr>
+                <w:lang w:val="en-US"/>
+              </w:rPr>
+              <w:t>BuyerName;type</w:t>
+            </w:r>
+            <w:proofErr w:type="gramEnd"/>
+            <w:r>
+              <w:rPr>
+                <w:lang w:val="en-US"/>
+              </w:rPr>
+              <w:t>=</w:t>
+            </w:r>
+            <w:proofErr w:type="gramStart"/>
+            <w:r>
+              <w:rPr>
+                <w:lang w:val="en-US"/>
+              </w:rPr>
+              <w:t>text;role</w:t>
+            </w:r>
+            <w:proofErr w:type="gramEnd"/>
+            <w:r>
+              <w:rPr>
+                <w:lang w:val="en-US"/>
+              </w:rPr>
+              <w:t>=Buyer}}</w:t>
+            </w:r>
+          </w:p>
+          <w:p>
+            <w:pPr>
+              <w:pStyle w:val="BodyA"/>
+            </w:pPr>
+          </w:p>
+        </w:tc>
+        <w:tc>
+          <w:tcPr>
+            <w:tcW w:w="4544" w:type="dxa"/>
+          </w:tcPr>
+          <w:p>
+            <w:pPr>
+              <w:pStyle w:val="BodyA"/>
+              <w:rPr>
+                <w:lang w:val="de-DE"/>
+              </w:rPr>
+            </w:pPr>
+            <w:r>
+              <w:rPr>
+                <w:lang w:val="de-DE"/>
+              </w:rPr>
+              <w:t xml:space="preserve">Seller Name: </w:t>
+            </w:r>
+          </w:p>
+          <w:p>
+            <w:pPr>
+              <w:pStyle w:val="BodyA"/>
+              <w:rPr>
+                <w:lang w:val="de-DE"/>
+              </w:rPr>
+            </w:pPr>
+          </w:p>
+          <w:p>
+            <w:pPr>
+              <w:pStyle w:val="BodyA"/>
+            </w:pPr>
+            <w:r>
+              <w:rPr>
+                <w:lang w:val="de-DE"/>
+              </w:rPr>
+              <w:t>{{</w:t>
+            </w:r>
+            <w:proofErr w:type="gramStart"/>
+            <w:r>
+              <w:rPr>
+                <w:lang w:val="de-DE"/>
+              </w:rPr>
+              <w:t>SellerName;type</w:t>
+            </w:r>
+            <w:proofErr w:type="gramEnd"/>
+            <w:r>
+              <w:rPr>
+                <w:lang w:val="de-DE"/>
+              </w:rPr>
+              <w:t>=</w:t>
+            </w:r>
+            <w:proofErr w:type="gramStart"/>
+            <w:r>
+              <w:rPr>
+                <w:lang w:val="de-DE"/>
+              </w:rPr>
+              <w:t>text;role</w:t>
+            </w:r>
+            <w:proofErr w:type="gramEnd"/>
+            <w:r>
+              <w:rPr>
+                <w:lang w:val="de-DE"/>
+              </w:rPr>
+              <w:t>=Seller}}</w:t>
             </w:r>
           </w:p>
           <w:p>
@@ -795,28 +1111,146 @@
             </w:pPr>
           </w:p>
         </w:tc>
+        <w:tc>
+          <w:tcPr>
+            <w:tcW w:w="221" w:type="dxa"/>
+          </w:tcPr>
+          <w:p>
+            <w:pPr>
+              <w:pStyle w:val="BodyA"/>
+              <w:rPr>
+                <w:lang w:val="de-DE"/>
+              </w:rPr>
+            </w:pPr>
+            <w:r>
+              <w:rPr>
+                <w:lang w:val="de-DE"/>
+              </w:rPr>
+              <w:t>Owner</w:t>
+            </w:r>
+            <w:r>
+              <w:rPr>
+                <w:lang w:val="de-DE"/>
+              </w:rPr>
+              <w:t xml:space="preserve"> Name: </w:t>
+            </w:r>
+          </w:p>
+          <w:p>
+            <w:pPr>
+              <w:pStyle w:val="BodyA"/>
+              <w:rPr>
+                <w:lang w:val="de-DE"/>
+              </w:rPr>
+            </w:pPr>
+          </w:p>
+          <w:p>
+            <w:pPr>
+              <w:pStyle w:val="BodyA"/>
+            </w:pPr>
+            <w:r>
+              <w:rPr>
+                <w:lang w:val="de-DE"/>
+              </w:rPr>
+              <w:t>{{</w:t>
+            </w:r>
+            <w:proofErr w:type="gramStart"/>
+            <w:r>
+              <w:rPr>
+                <w:lang w:val="de-DE"/>
+              </w:rPr>
+              <w:t>Owner</w:t>
+            </w:r>
+            <w:r>
+              <w:rPr>
+                <w:lang w:val="de-DE"/>
+              </w:rPr>
+              <w:t>Name;type</w:t>
+            </w:r>
+            <w:proofErr w:type="gramEnd"/>
+            <w:r>
+              <w:rPr>
+                <w:lang w:val="de-DE"/>
+              </w:rPr>
+              <w:t>=</w:t>
+            </w:r>
+            <w:proofErr w:type="gramStart"/>
+            <w:r>
+              <w:rPr>
+                <w:lang w:val="de-DE"/>
+              </w:rPr>
+              <w:t>text;role</w:t>
+            </w:r>
+            <w:proofErr w:type="gramEnd"/>
+            <w:r>
+              <w:rPr>
+                <w:lang w:val="de-DE"/>
+              </w:rPr>
+              <w:t>=</w:t>
+            </w:r>
+            <w:r>
+              <w:rPr>
+                <w:lang w:val="de-DE"/>
+              </w:rPr>
+              <w:t>Owner</w:t>
+            </w:r>
+            <w:r>
+              <w:rPr>
+                <w:lang w:val="de-DE"/>
+              </w:rPr>
+              <w:t>}}</w:t>
+            </w:r>
+          </w:p>
+          <w:p>
+            <w:pPr>
+              <w:pStyle w:val="BodyA"/>
+              <w:rPr>
+                <w:lang w:val="de-DE"/>
+              </w:rPr>
+            </w:pPr>
+          </w:p>
+        </w:tc>
       </w:tr>
       <w:tr>
         <w:tc>
           <w:tcPr>
-            <w:tcW w:w="4675" w:type="dxa"/>
+            <w:tcW w:w="4585" w:type="dxa"/>
           </w:tcPr>
           <w:p>
             <w:pPr>
               <w:pStyle w:val="BodyA"/>
-            </w:pPr>
-            <w:r>
-              <w:rPr>
-                <w:lang w:val="en-US"/>
-              </w:rPr>
-              <w:t>Buyer Name: {{</w:t>
+              <w:rPr>
+                <w:lang w:val="en-US"/>
+              </w:rPr>
+            </w:pPr>
+            <w:r>
+              <w:rPr>
+                <w:lang w:val="en-US"/>
+              </w:rPr>
+              <w:t xml:space="preserve">Date: </w:t>
+            </w:r>
+          </w:p>
+          <w:p>
+            <w:pPr>
+              <w:pStyle w:val="BodyA"/>
+            </w:pPr>
+            <w:r>
+              <w:rPr>
+                <w:lang w:val="en-US"/>
+              </w:rPr>
+              <w:br/>
+            </w:r>
+            <w:r>
+              <w:rPr>
+                <w:lang w:val="en-US"/>
+              </w:rPr>
+              <w:t>{{</w:t>
             </w:r>
             <w:proofErr w:type="gramStart"/>
             <w:r>
               <w:rPr>
                 <w:lang w:val="en-US"/>
               </w:rPr>
-              <w:t>BuyerName;type</w:t>
+              <w:t>BuyerDate;type</w:t>
             </w:r>
             <w:proofErr w:type="gramEnd"/>
             <w:r>
@@ -830,7 +1264,7 @@
               <w:rPr>
                 <w:lang w:val="en-US"/>
               </w:rPr>
-              <w:t>text;role</w:t>
+              <w:t>date;role</w:t>
             </w:r>
             <w:proofErr w:type="gramEnd"/>
             <w:r>
@@ -856,24 +1290,46 @@
         </w:tc>
         <w:tc>
           <w:tcPr>
-            <w:tcW w:w="4675" w:type="dxa"/>
+            <w:tcW w:w="4544" w:type="dxa"/>
           </w:tcPr>
           <w:p>
             <w:pPr>
               <w:pStyle w:val="BodyA"/>
-            </w:pPr>
-            <w:r>
-              <w:rPr>
-                <w:lang w:val="de-DE"/>
-              </w:rPr>
-              <w:t>Seller Name: {{</w:t>
+              <w:rPr>
+                <w:lang w:val="de-DE"/>
+              </w:rPr>
+            </w:pPr>
+            <w:r>
+              <w:rPr>
+                <w:lang w:val="de-DE"/>
+              </w:rPr>
+              <w:t xml:space="preserve">Date: </w:t>
+            </w:r>
+          </w:p>
+          <w:p>
+            <w:pPr>
+              <w:pStyle w:val="BodyA"/>
+              <w:rPr>
+                <w:lang w:val="de-DE"/>
+              </w:rPr>
+            </w:pPr>
+          </w:p>
+          <w:p>
+            <w:pPr>
+              <w:pStyle w:val="BodyA"/>
+            </w:pPr>
+            <w:r>
+              <w:rPr>
+                <w:lang w:val="de-DE"/>
+              </w:rPr>
+              <w:t>{{</w:t>
             </w:r>
             <w:proofErr w:type="gramStart"/>
             <w:r>
               <w:rPr>
                 <w:lang w:val="de-DE"/>
               </w:rPr>
-              <w:t>SellerName;type</w:t>
+              <w:t>SellerDate;type</w:t>
             </w:r>
             <w:proofErr w:type="gramEnd"/>
             <w:r>
@@ -887,7 +1343,7 @@
               <w:rPr>
                 <w:lang w:val="de-DE"/>
               </w:rPr>
-              <w:t>text;role</w:t>
+              <w:t>date;role</w:t>
             </w:r>
             <w:proofErr w:type="gramEnd"/>
             <w:r>
@@ -911,119 +1367,83 @@
             </w:pPr>
           </w:p>
         </w:tc>
-      </w:tr>
-      <w:tr>
         <w:tc>
           <w:tcPr>
-            <w:tcW w:w="4675" w:type="dxa"/>
+            <w:tcW w:w="221" w:type="dxa"/>
           </w:tcPr>
           <w:p>
             <w:pPr>
               <w:pStyle w:val="BodyA"/>
-            </w:pPr>
-            <w:r>
-              <w:rPr>
-                <w:lang w:val="en-US"/>
-              </w:rPr>
-              <w:t>Date: {{</w:t>
+              <w:rPr>
+                <w:lang w:val="de-DE"/>
+              </w:rPr>
+            </w:pPr>
+            <w:r>
+              <w:rPr>
+                <w:lang w:val="de-DE"/>
+              </w:rPr>
+              <w:t xml:space="preserve">Date: </w:t>
+            </w:r>
+          </w:p>
+          <w:p>
+            <w:pPr>
+              <w:pStyle w:val="BodyA"/>
+              <w:rPr>
+                <w:lang w:val="de-DE"/>
+              </w:rPr>
+            </w:pPr>
+          </w:p>
+          <w:p>
+            <w:pPr>
+              <w:pStyle w:val="BodyA"/>
+            </w:pPr>
+            <w:r>
+              <w:rPr>
+                <w:lang w:val="de-DE"/>
+              </w:rPr>
+              <w:t>{{</w:t>
             </w:r>
             <w:proofErr w:type="gramStart"/>
             <w:r>
               <w:rPr>
-                <w:lang w:val="en-US"/>
-              </w:rPr>
-              <w:t>BuyerDate;type</w:t>
+                <w:lang w:val="de-DE"/>
+              </w:rPr>
+              <w:t>Owner</w:t>
+            </w:r>
+            <w:r>
+              <w:rPr>
+                <w:lang w:val="de-DE"/>
+              </w:rPr>
+              <w:t>Date;type</w:t>
             </w:r>
             <w:proofErr w:type="gramEnd"/>
             <w:r>
               <w:rPr>
-                <w:lang w:val="en-US"/>
+                <w:lang w:val="de-DE"/>
               </w:rPr>
               <w:t>=</w:t>
             </w:r>
             <w:proofErr w:type="gramStart"/>
             <w:r>
               <w:rPr>
-                <w:lang w:val="en-US"/>
+                <w:lang w:val="de-DE"/>
               </w:rPr>
               <w:t>date;role</w:t>
             </w:r>
             <w:proofErr w:type="gramEnd"/>
             <w:r>
               <w:rPr>
-                <w:lang w:val="en-US"/>
-              </w:rPr>
-              <w:t>=Buyer}}</w:t>
-            </w:r>
-          </w:p>
-          <w:p>
-            <w:pPr>
-              <w:pStyle w:val="BodyA"/>
-              <w:pBdr>
-                <w:top w:val="none" w:sz="0" w:space="0" w:color="auto"/>
-                <w:left w:val="none" w:sz="0" w:space="0" w:color="auto"/>
-                <w:bottom w:val="none" w:sz="0" w:space="0" w:color="auto"/>
-                <w:right w:val="none" w:sz="0" w:space="0" w:color="auto"/>
-                <w:between w:val="none" w:sz="0" w:space="0" w:color="auto"/>
-                <w:bar w:val="none" w:sz="0" w:color="auto"/>
-              </w:pBdr>
-            </w:pPr>
-          </w:p>
-        </w:tc>
-        <w:tc>
-          <w:tcPr>
-            <w:tcW w:w="4675" w:type="dxa"/>
-          </w:tcPr>
-          <w:p>
-            <w:pPr>
-              <w:pStyle w:val="BodyA"/>
-            </w:pPr>
-            <w:r>
-              <w:rPr>
-                <w:lang w:val="de-DE"/>
-              </w:rPr>
-              <w:t>Date: {{</w:t>
-            </w:r>
-            <w:proofErr w:type="gramStart"/>
-            <w:r>
-              <w:rPr>
-                <w:lang w:val="de-DE"/>
-              </w:rPr>
-              <w:t>SellerDate;type</w:t>
-            </w:r>
-            <w:proofErr w:type="gramEnd"/>
-            <w:r>
-              <w:rPr>
-                <w:lang w:val="de-DE"/>
-              </w:rPr>
-              <w:t>=</w:t>
-            </w:r>
-            <w:proofErr w:type="gramStart"/>
-            <w:r>
-              <w:rPr>
-                <w:lang w:val="de-DE"/>
-              </w:rPr>
-              <w:t>date;role</w:t>
-            </w:r>
-            <w:proofErr w:type="gramEnd"/>
-            <w:r>
-              <w:rPr>
-                <w:lang w:val="de-DE"/>
-              </w:rPr>
-              <w:t>=Seller}}</w:t>
-            </w:r>
-          </w:p>
-          <w:p>
-            <w:pPr>
-              <w:pStyle w:val="BodyA"/>
-              <w:pBdr>
-                <w:top w:val="none" w:sz="0" w:space="0" w:color="auto"/>
-                <w:left w:val="none" w:sz="0" w:space="0" w:color="auto"/>
-                <w:bottom w:val="none" w:sz="0" w:space="0" w:color="auto"/>
-                <w:right w:val="none" w:sz="0" w:space="0" w:color="auto"/>
-                <w:between w:val="none" w:sz="0" w:space="0" w:color="auto"/>
-                <w:bar w:val="none" w:sz="0" w:color="auto"/>
-              </w:pBdr>
+                <w:lang w:val="de-DE"/>
+              </w:rPr>
+              <w:t>=Owner}}</w:t>
+            </w:r>
+          </w:p>
+          <w:p>
+            <w:pPr>
+              <w:pStyle w:val="BodyA"/>
+              <w:rPr>
+                <w:lang w:val="de-DE"/>
+              </w:rPr>
             </w:pPr>
           </w:p>
         </w:tc>

</xml_diff>

<commit_message>
feat(branding): add custom logo, name, and stamp support
Allow accounts to set custom logo, company name, and stamp URL.
Configurable via API or Personalization Settings UI.
Branding applies to signing forms, emails, admin navbar, and audit trail.
Stamp fields pre-fill with custom images and support `position` preference.
</commit_message>
<xml_diff>
--- a/docs/samples/simple.docx
+++ b/docs/samples/simple.docx
@@ -670,9 +670,9 @@
         <w:tblLook w:val="04A0" w:firstRow="1" w:lastRow="0" w:firstColumn="1" w:lastColumn="0" w:noHBand="0" w:noVBand="1"/>
       </w:tblPr>
       <w:tblGrid>
-        <w:gridCol w:w="3099"/>
-        <w:gridCol w:w="3073"/>
-        <w:gridCol w:w="3178"/>
+        <w:gridCol w:w="3807"/>
+        <w:gridCol w:w="2725"/>
+        <w:gridCol w:w="2818"/>
       </w:tblGrid>
       <w:tr>
         <w:tc>
@@ -711,6 +711,69 @@
                 <w:lang w:val="en-US"/>
               </w:rPr>
               <w:t>{{</w:t>
+            </w:r>
+            <w:proofErr w:type="gramStart"/>
+            <w:r>
+              <w:rPr>
+                <w:lang w:val="en-US"/>
+              </w:rPr>
+              <w:t>CompanyStamp;type</w:t>
+            </w:r>
+            <w:proofErr w:type="gramEnd"/>
+            <w:r>
+              <w:rPr>
+                <w:lang w:val="en-US"/>
+              </w:rPr>
+              <w:t>=</w:t>
+            </w:r>
+            <w:proofErr w:type="gramStart"/>
+            <w:r>
+              <w:rPr>
+                <w:lang w:val="en-US"/>
+              </w:rPr>
+              <w:t>stamp;role</w:t>
+            </w:r>
+            <w:proofErr w:type="gramEnd"/>
+            <w:r>
+              <w:rPr>
+                <w:lang w:val="en-US"/>
+              </w:rPr>
+              <w:t>=Buyer</w:t>
+            </w:r>
+            <w:r>
+              <w:rPr>
+                <w:lang w:val="en-US"/>
+              </w:rPr>
+              <w:t>;</w:t>
+            </w:r>
+            <w:r>
+              <w:t xml:space="preserve"> </w:t>
+            </w:r>
+            <w:r>
+              <w:rPr>
+                <w:lang w:val="en-US"/>
+              </w:rPr>
+              <w:t>position=background</w:t>
+            </w:r>
+            <w:proofErr w:type="gramStart"/>
+            <w:r>
+              <w:rPr>
+                <w:lang w:val="en-US"/>
+              </w:rPr>
+              <w:t>}}</w:t>
+            </w:r>
+            <w:r>
+              <w:rPr>
+                <w:lang w:val="en-US"/>
+              </w:rPr>
+              <w:t>{</w:t>
+            </w:r>
+            <w:proofErr w:type="gramEnd"/>
+            <w:r>
+              <w:rPr>
+                <w:lang w:val="en-US"/>
+              </w:rPr>
+              <w:t>{</w:t>
             </w:r>
             <w:proofErr w:type="gramStart"/>
             <w:r>

</xml_diff>

<commit_message>
feat: add webhooks API and enhance DOCX processing
Introduces a new API for managing webhooks, allowing users to subscribe
to events like `form.completed` and `submission.completed`.

Refactors DOCX processing to use a single PDF for both display and tag
position detection. Tags are now made invisible (white font) in the
DOCX before conversion, preserving layout. This enables automatic
extraction and application of DOCX paragraph formatting (alignment,
font family, font size) to rendered form fields.

Adds support for `align` preference for signature and initials fields
in the UI and PDF output. The `datenow` field type is now readonly
and auto-filled with the current date upon completion.
`[[...]]` variables can now be defined at the submitter level.

Updates API and template documentation to reflect these changes.
</commit_message>
<xml_diff>
--- a/docs/samples/simple.docx
+++ b/docs/samples/simple.docx
@@ -927,13 +927,7 @@
               <w:rPr>
                 <w:lang w:val="en-US"/>
               </w:rPr>
-              <w:t>Owner</w:t>
-            </w:r>
-            <w:r>
-              <w:rPr>
-                <w:lang w:val="en-US"/>
-              </w:rPr>
-              <w:t xml:space="preserve"> Signature: </w:t>
+              <w:t xml:space="preserve">Owner Signature: </w:t>
             </w:r>
           </w:p>
           <w:p>
@@ -962,13 +956,7 @@
               <w:rPr>
                 <w:lang w:val="en-US"/>
               </w:rPr>
-              <w:t>Owner</w:t>
-            </w:r>
-            <w:r>
-              <w:rPr>
-                <w:lang w:val="en-US"/>
-              </w:rPr>
-              <w:t>Sign;type</w:t>
+              <w:t>OwnerSign;type</w:t>
             </w:r>
             <w:proofErr w:type="gramEnd"/>
             <w:r>
@@ -996,13 +984,7 @@
               <w:rPr>
                 <w:lang w:val="en-US"/>
               </w:rPr>
-              <w:t>Owner</w:t>
-            </w:r>
-            <w:r>
-              <w:rPr>
-                <w:lang w:val="en-US"/>
-              </w:rPr>
-              <w:t>;required</w:t>
+              <w:t>Owner;required</w:t>
             </w:r>
             <w:proofErr w:type="gramEnd"/>
             <w:r>
@@ -1189,13 +1171,7 @@
               <w:rPr>
                 <w:lang w:val="de-DE"/>
               </w:rPr>
-              <w:t>Owner</w:t>
-            </w:r>
-            <w:r>
-              <w:rPr>
-                <w:lang w:val="de-DE"/>
-              </w:rPr>
-              <w:t xml:space="preserve"> Name: </w:t>
+              <w:t xml:space="preserve">Owner Name: </w:t>
             </w:r>
           </w:p>
           <w:p>
@@ -1221,13 +1197,7 @@
               <w:rPr>
                 <w:lang w:val="de-DE"/>
               </w:rPr>
-              <w:t>Owner</w:t>
-            </w:r>
-            <w:r>
-              <w:rPr>
-                <w:lang w:val="de-DE"/>
-              </w:rPr>
-              <w:t>Name;type</w:t>
+              <w:t>OwnerName;type</w:t>
             </w:r>
             <w:proofErr w:type="gramEnd"/>
             <w:r>
@@ -1248,19 +1218,7 @@
               <w:rPr>
                 <w:lang w:val="de-DE"/>
               </w:rPr>
-              <w:t>=</w:t>
-            </w:r>
-            <w:r>
-              <w:rPr>
-                <w:lang w:val="de-DE"/>
-              </w:rPr>
-              <w:t>Owner</w:t>
-            </w:r>
-            <w:r>
-              <w:rPr>
-                <w:lang w:val="de-DE"/>
-              </w:rPr>
-              <w:t>}}</w:t>
+              <w:t>=Owner}}</w:t>
             </w:r>
           </w:p>
           <w:p>
@@ -1471,13 +1429,7 @@
               <w:rPr>
                 <w:lang w:val="de-DE"/>
               </w:rPr>
-              <w:t>Owner</w:t>
-            </w:r>
-            <w:r>
-              <w:rPr>
-                <w:lang w:val="de-DE"/>
-              </w:rPr>
-              <w:t>Date;type</w:t>
+              <w:t>OwnerDate;type</w:t>
             </w:r>
             <w:proofErr w:type="gramEnd"/>
             <w:r>

</xml_diff>